<commit_message>
updating cv and research page
</commit_message>
<xml_diff>
--- a/src/images/cv/JaimeRiosCV.docx
+++ b/src/images/cv/JaimeRiosCV.docx
@@ -1697,55 +1697,7 @@
           <w:sz w:val="22"/>
           <w:szCs w:val="22"/>
         </w:rPr>
-        <w:t xml:space="preserve">. </w:t>
-      </w:r>
-      <w:r>
-        <w:rPr>
-          <w:b w:val="0"/>
-          <w:sz w:val="22"/>
-          <w:szCs w:val="22"/>
-        </w:rPr>
-        <w:t>Cognitive Neuroscience</w:t>
-      </w:r>
-      <w:r>
-        <w:rPr>
-          <w:b w:val="0"/>
-          <w:sz w:val="22"/>
-          <w:szCs w:val="22"/>
-        </w:rPr>
-        <w:t xml:space="preserve"> Society. </w:t>
-      </w:r>
-      <w:r>
-        <w:rPr>
-          <w:b w:val="0"/>
-          <w:sz w:val="22"/>
-          <w:szCs w:val="22"/>
-        </w:rPr>
-        <w:t>Vancouver</w:t>
-      </w:r>
-      <w:r>
-        <w:rPr>
-          <w:b w:val="0"/>
-          <w:sz w:val="22"/>
-          <w:szCs w:val="22"/>
-        </w:rPr>
-        <w:t xml:space="preserve">, </w:t>
-      </w:r>
-      <w:r>
-        <w:rPr>
-          <w:b w:val="0"/>
-          <w:sz w:val="22"/>
-          <w:szCs w:val="22"/>
-        </w:rPr>
-        <w:t>Canada</w:t>
-      </w:r>
-      <w:r>
-        <w:rPr>
-          <w:b w:val="0"/>
-          <w:sz w:val="22"/>
-          <w:szCs w:val="22"/>
-        </w:rPr>
-        <w:t xml:space="preserve">. </w:t>
+        <w:t xml:space="preserve">. Cognitive Neuroscience Society. Vancouver, Canada. </w:t>
       </w:r>
       <w:r>
         <w:rPr>
@@ -1793,23 +1745,7 @@
           <w:sz w:val="22"/>
           <w:szCs w:val="22"/>
         </w:rPr>
-        <w:t>, 202</w:t>
-      </w:r>
-      <w:r>
-        <w:rPr>
-          <w:b w:val="0"/>
-          <w:sz w:val="22"/>
-          <w:szCs w:val="22"/>
-        </w:rPr>
-        <w:t>6</w:t>
-      </w:r>
-      <w:r>
-        <w:rPr>
-          <w:b w:val="0"/>
-          <w:sz w:val="22"/>
-          <w:szCs w:val="22"/>
-        </w:rPr>
-        <w:t>.</w:t>
+        <w:t>, 2026.</w:t>
       </w:r>
     </w:p>
     <w:p>
@@ -3094,7 +3030,37 @@
         <w:rPr>
           <w:i/>
         </w:rPr>
-        <w:t>Last Updated 8/25/24</w:t>
+        <w:t xml:space="preserve">Last Updated </w:t>
+      </w:r>
+      <w:r>
+        <w:rPr>
+          <w:i/>
+        </w:rPr>
+        <w:t>4</w:t>
+      </w:r>
+      <w:r>
+        <w:rPr>
+          <w:i/>
+        </w:rPr>
+        <w:t>/2</w:t>
+      </w:r>
+      <w:r>
+        <w:rPr>
+          <w:i/>
+        </w:rPr>
+        <w:t>1</w:t>
+      </w:r>
+      <w:r>
+        <w:rPr>
+          <w:i/>
+        </w:rPr>
+        <w:t>/2</w:t>
+      </w:r>
+      <w:r>
+        <w:rPr>
+          <w:i/>
+        </w:rPr>
+        <w:t>6</w:t>
       </w:r>
     </w:p>
     <w:sectPr>

</xml_diff>